<commit_message>
feat: add environment variable injection script and Vercel deployment configuration
</commit_message>
<xml_diff>
--- a/Requirements/Deployment_Plan.docx
+++ b/Requirements/Deployment_Plan.docx
@@ -487,12 +487,140 @@
         <w:rPr>
           <w:color w:val="1F3A5F"/>
         </w:rPr>
-        <w:t>2.4 Environment-specific API URL</w:t>
+        <w:t>2.4 Environment Variables</w:t>
       </w:r>
     </w:p>
     <w:p>
       <w:r>
-        <w:t>Angular environment files (environment.ts / environment.prod.ts) should define apiBaseUrl pointing at the EC2-hosted backend's public HTTPS endpoint (e.g. via a domain such as api.tnbicoms.com fronted by a load balancer or reverse proxy). No secrets are stored in the frontend build since the API URL is public-facing.</w:t>
+        <w:t>Angular does not read process.env at build time by default — environment.ts is compiled into the bundle as static values. To make the backend API URL configurable per Vercel environment without hardcoding it in source, a pre-build script (frontend/set-env.js) generates environment.ts from a Vercel environment variable immediately before ng build runs (wired via vercel.json — see Section 2.5).</w:t>
+      </w:r>
+    </w:p>
+    <w:p>
+      <w:r>
+        <w:t>Set the following in the Vercel project (Settings → Environment Variables):</w:t>
+      </w:r>
+    </w:p>
+    <w:tbl>
+      <w:tblPr>
+        <w:tblStyle w:val="LightGrid-Accent1"/>
+        <w:tblW w:type="auto" w:w="0"/>
+        <w:jc w:val="left"/>
+        <w:tblLook w:firstColumn="1" w:firstRow="1" w:lastColumn="0" w:lastRow="0" w:noHBand="0" w:noVBand="1" w:val="04A0"/>
+      </w:tblPr>
+      <w:tblGrid>
+        <w:gridCol w:w="2160"/>
+        <w:gridCol w:w="2160"/>
+        <w:gridCol w:w="2160"/>
+        <w:gridCol w:w="2160"/>
+      </w:tblGrid>
+      <w:tr>
+        <w:tc>
+          <w:tcPr>
+            <w:tcW w:type="dxa" w:w="2160"/>
+            <w:shd w:val="clear" w:color="auto" w:fill="1F3A5F"/>
+          </w:tcPr>
+          <w:p>
+            <w:r>
+              <w:rPr>
+                <w:b/>
+                <w:color w:val="FFFFFF"/>
+              </w:rPr>
+              <w:t>Variable</w:t>
+            </w:r>
+          </w:p>
+        </w:tc>
+        <w:tc>
+          <w:tcPr>
+            <w:tcW w:type="dxa" w:w="2160"/>
+            <w:shd w:val="clear" w:color="auto" w:fill="1F3A5F"/>
+          </w:tcPr>
+          <w:p>
+            <w:r>
+              <w:rPr>
+                <w:b/>
+                <w:color w:val="FFFFFF"/>
+              </w:rPr>
+              <w:t>Example value</w:t>
+            </w:r>
+          </w:p>
+        </w:tc>
+        <w:tc>
+          <w:tcPr>
+            <w:tcW w:type="dxa" w:w="2160"/>
+            <w:shd w:val="clear" w:color="auto" w:fill="1F3A5F"/>
+          </w:tcPr>
+          <w:p>
+            <w:r>
+              <w:rPr>
+                <w:b/>
+                <w:color w:val="FFFFFF"/>
+              </w:rPr>
+              <w:t>Environments</w:t>
+            </w:r>
+          </w:p>
+        </w:tc>
+        <w:tc>
+          <w:tcPr>
+            <w:tcW w:type="dxa" w:w="2160"/>
+            <w:shd w:val="clear" w:color="auto" w:fill="1F3A5F"/>
+          </w:tcPr>
+          <w:p>
+            <w:r>
+              <w:rPr>
+                <w:b/>
+                <w:color w:val="FFFFFF"/>
+              </w:rPr>
+              <w:t>Notes</w:t>
+            </w:r>
+          </w:p>
+        </w:tc>
+      </w:tr>
+      <w:tr>
+        <w:tc>
+          <w:tcPr>
+            <w:tcW w:type="dxa" w:w="2160"/>
+          </w:tcPr>
+          <w:p>
+            <w:r>
+              <w:t>NG_APP_API_URL</w:t>
+            </w:r>
+          </w:p>
+        </w:tc>
+        <w:tc>
+          <w:tcPr>
+            <w:tcW w:type="dxa" w:w="2160"/>
+          </w:tcPr>
+          <w:p>
+            <w:r>
+              <w:t>https://api.tnbicoms.com/api</w:t>
+            </w:r>
+          </w:p>
+        </w:tc>
+        <w:tc>
+          <w:tcPr>
+            <w:tcW w:type="dxa" w:w="2160"/>
+          </w:tcPr>
+          <w:p>
+            <w:r>
+              <w:t>Production, Preview, Development</w:t>
+            </w:r>
+          </w:p>
+        </w:tc>
+        <w:tc>
+          <w:tcPr>
+            <w:tcW w:type="dxa" w:w="2160"/>
+          </w:tcPr>
+          <w:p>
+            <w:r>
+              <w:t>Base URL of the .NET API hosted on EC2. Not a secret (public-facing), but centralizing it avoids hardcoding and lets Preview deployments point at a staging API if desired.</w:t>
+            </w:r>
+          </w:p>
+        </w:tc>
+      </w:tr>
+    </w:tbl>
+    <w:p>
+      <w:r>
+        <w:t>If a separate staging/EC2 endpoint exists for pre-production testing, set NG_APP_API_URL differently for the Preview environment (e.g. https://staging-api.tnbicoms.com/api) versus Production. No other frontend environment variables are required at this time since the Angular app holds no API keys or secrets.</w:t>
       </w:r>
     </w:p>
     <w:p>
@@ -503,12 +631,12 @@
         <w:rPr>
           <w:color w:val="1F3A5F"/>
         </w:rPr>
-        <w:t>2.5 Routing (SPA fallback)</w:t>
+        <w:t>2.5 Routing (SPA fallback) &amp; Build Wiring</w:t>
       </w:r>
     </w:p>
     <w:p>
       <w:r>
-        <w:t>A vercel.json file is added to the frontend project root with a rewrite rule so that all client-side Angular routes resolve to index.html:</w:t>
+        <w:t>A vercel.json file has been added at frontend/vercel.json. It runs set-env.js before the Angular build (so NG_APP_API_URL is baked into environment.ts), pins the build command and output directory (Angular 18's application builder emits to dist/frontend/browser, per angular.json), and adds a rewrite rule so that all client-side Angular routes resolve to index.html:</w:t>
       </w:r>
     </w:p>
     <w:p>
@@ -521,6 +649,10 @@
           <w:sz w:val="18"/>
         </w:rPr>
         <w:t>{</w:t>
+        <w:br/>
+        <w:t xml:space="preserve">  "buildCommand": "node set-env.js &amp;&amp; npm run build",</w:t>
+        <w:br/>
+        <w:t xml:space="preserve">  "outputDirectory": "dist/frontend/browser",</w:t>
         <w:br/>
         <w:t xml:space="preserve">  "rewrites": [</w:t>
         <w:br/>

</xml_diff>